<commit_message>
divided approach, improved documentations
</commit_message>
<xml_diff>
--- a/Documentation/# Documentation.docx
+++ b/Documentation/# Documentation.docx
@@ -1372,7 +1372,23 @@
                 <w:sz w:val="20"/>
                 <w:szCs w:val="24"/>
               </w:rPr>
-              <w:t>%USERPROFILE%\AppData\Local\Google\Chrome\User Data\Default\History</w:t>
+              <w:t>%USERPROFILE%\</w:t>
+            </w:r>
+            <w:proofErr w:type="spellStart"/>
+            <w:r>
+              <w:rPr>
+                <w:sz w:val="20"/>
+                <w:szCs w:val="24"/>
+              </w:rPr>
+              <w:t>AppData</w:t>
+            </w:r>
+            <w:proofErr w:type="spellEnd"/>
+            <w:r>
+              <w:rPr>
+                <w:sz w:val="20"/>
+                <w:szCs w:val="24"/>
+              </w:rPr>
+              <w:t>\Local\Google\Chrome\User Data\Default\History</w:t>
             </w:r>
           </w:p>
         </w:tc>
@@ -1626,8 +1642,17 @@
                 <w:sz w:val="20"/>
                 <w:szCs w:val="24"/>
               </w:rPr>
-              <w:t>sqlite3.exe + chrome_history_archive.db</w:t>
+              <w:t xml:space="preserve">sqlite3.exe + </w:t>
             </w:r>
+            <w:proofErr w:type="spellStart"/>
+            <w:r>
+              <w:rPr>
+                <w:sz w:val="20"/>
+                <w:szCs w:val="24"/>
+              </w:rPr>
+              <w:t>chrome_history_archive.db</w:t>
+            </w:r>
+            <w:proofErr w:type="spellEnd"/>
           </w:p>
         </w:tc>
         <w:tc>
@@ -1743,6 +1768,7 @@
                 <w:szCs w:val="24"/>
               </w:rPr>
             </w:pPr>
+            <w:proofErr w:type="spellStart"/>
             <w:r>
               <w:rPr>
                 <w:sz w:val="20"/>
@@ -1750,6 +1776,7 @@
               </w:rPr>
               <w:t>ChromeHistoryMonitor</w:t>
             </w:r>
+            <w:proofErr w:type="spellEnd"/>
           </w:p>
         </w:tc>
         <w:tc>
@@ -2455,6 +2482,7 @@
                 <w:szCs w:val="24"/>
               </w:rPr>
             </w:pPr>
+            <w:proofErr w:type="spellStart"/>
             <w:r>
               <w:rPr>
                 <w:sz w:val="20"/>
@@ -2462,6 +2490,7 @@
               </w:rPr>
               <w:t>ChromeHistoryService.cs</w:t>
             </w:r>
+            <w:proofErr w:type="spellEnd"/>
             <w:r>
               <w:rPr>
                 <w:sz w:val="20"/>
@@ -2586,6 +2615,7 @@
                 <w:szCs w:val="24"/>
               </w:rPr>
             </w:pPr>
+            <w:proofErr w:type="spellStart"/>
             <w:r>
               <w:rPr>
                 <w:sz w:val="20"/>
@@ -2593,6 +2623,7 @@
               </w:rPr>
               <w:t>chrome_history_archive.db</w:t>
             </w:r>
+            <w:proofErr w:type="spellEnd"/>
           </w:p>
         </w:tc>
         <w:tc>
@@ -2916,12 +2947,21 @@
                 <w:szCs w:val="24"/>
               </w:rPr>
             </w:pPr>
+            <w:proofErr w:type="spellStart"/>
             <w:r>
               <w:rPr>
                 <w:sz w:val="20"/>
                 <w:szCs w:val="24"/>
               </w:rPr>
-              <w:t>localfile entry for chrome_history.log.</w:t>
+              <w:t>localfile</w:t>
+            </w:r>
+            <w:proofErr w:type="spellEnd"/>
+            <w:r>
+              <w:rPr>
+                <w:sz w:val="20"/>
+                <w:szCs w:val="24"/>
+              </w:rPr>
+              <w:t xml:space="preserve"> entry for chrome_history.log.</w:t>
             </w:r>
           </w:p>
         </w:tc>
@@ -3114,7 +3154,23 @@
           <w:sz w:val="23"/>
           <w:szCs w:val="24"/>
         </w:rPr>
-        <w:t>Only records newer than the archive cursor are emitted.</w:t>
+        <w:t xml:space="preserve">Only records newer than the archive cursor </w:t>
+      </w:r>
+      <w:proofErr w:type="gramStart"/>
+      <w:r>
+        <w:rPr>
+          <w:sz w:val="23"/>
+          <w:szCs w:val="24"/>
+        </w:rPr>
+        <w:t>are</w:t>
+      </w:r>
+      <w:proofErr w:type="gramEnd"/>
+      <w:r>
+        <w:rPr>
+          <w:sz w:val="23"/>
+          <w:szCs w:val="24"/>
+        </w:rPr>
+        <w:t xml:space="preserve"> emitted.</w:t>
       </w:r>
     </w:p>
     <w:p>
@@ -3145,6 +3201,7 @@
         <w:t>. Common Problems and Solutions</w:t>
       </w:r>
     </w:p>
+    <w:p/>
     <w:tbl>
       <w:tblPr>
         <w:tblW w:w="0" w:type="auto"/>
@@ -3288,7 +3345,23 @@
                 <w:sz w:val="20"/>
                 <w:szCs w:val="24"/>
               </w:rPr>
-              <w:t>Use WAL, busy_timeout, one transaction, and service overlap guard.</w:t>
+              <w:t xml:space="preserve">Use WAL, </w:t>
+            </w:r>
+            <w:proofErr w:type="spellStart"/>
+            <w:r>
+              <w:rPr>
+                <w:sz w:val="20"/>
+                <w:szCs w:val="24"/>
+              </w:rPr>
+              <w:t>busy_timeout</w:t>
+            </w:r>
+            <w:proofErr w:type="spellEnd"/>
+            <w:r>
+              <w:rPr>
+                <w:sz w:val="20"/>
+                <w:szCs w:val="24"/>
+              </w:rPr>
+              <w:t>, one transaction, and service overlap guard.</w:t>
             </w:r>
           </w:p>
         </w:tc>
@@ -4427,12 +4500,21 @@
                 <w:szCs w:val="24"/>
               </w:rPr>
             </w:pPr>
+            <w:proofErr w:type="spellStart"/>
             <w:r>
               <w:rPr>
                 <w:sz w:val="20"/>
                 <w:szCs w:val="24"/>
               </w:rPr>
-              <w:t>ChromeUploadDetector-MVP</w:t>
+              <w:t>ChromeUploadDetector</w:t>
+            </w:r>
+            <w:proofErr w:type="spellEnd"/>
+            <w:r>
+              <w:rPr>
+                <w:sz w:val="20"/>
+                <w:szCs w:val="24"/>
+              </w:rPr>
+              <w:t>-MVP</w:t>
             </w:r>
           </w:p>
         </w:tc>
@@ -4663,7 +4745,39 @@
           <w:sz w:val="23"/>
           <w:szCs w:val="24"/>
         </w:rPr>
-        <w:t>Copy the ChromeUploadDetector-MVP directory into the common ProgramData directory.</w:t>
+        <w:t xml:space="preserve">Copy the </w:t>
+      </w:r>
+      <w:proofErr w:type="spellStart"/>
+      <w:r>
+        <w:rPr>
+          <w:sz w:val="23"/>
+          <w:szCs w:val="24"/>
+        </w:rPr>
+        <w:t>ChromeUploadDetector</w:t>
+      </w:r>
+      <w:proofErr w:type="spellEnd"/>
+      <w:r>
+        <w:rPr>
+          <w:sz w:val="23"/>
+          <w:szCs w:val="24"/>
+        </w:rPr>
+        <w:t xml:space="preserve">-MVP directory into the common </w:t>
+      </w:r>
+      <w:proofErr w:type="spellStart"/>
+      <w:r>
+        <w:rPr>
+          <w:sz w:val="23"/>
+          <w:szCs w:val="24"/>
+        </w:rPr>
+        <w:t>ProgramData</w:t>
+      </w:r>
+      <w:proofErr w:type="spellEnd"/>
+      <w:r>
+        <w:rPr>
+          <w:sz w:val="23"/>
+          <w:szCs w:val="24"/>
+        </w:rPr>
+        <w:t xml:space="preserve"> directory.</w:t>
       </w:r>
     </w:p>
     <w:p>
@@ -4727,7 +4841,23 @@
           <w:sz w:val="23"/>
           <w:szCs w:val="24"/>
         </w:rPr>
-        <w:t>Configure the upload detector as an Automatic LocalSystem Windows service.</w:t>
+        <w:t xml:space="preserve">Configure the upload detector as an Automatic </w:t>
+      </w:r>
+      <w:proofErr w:type="spellStart"/>
+      <w:r>
+        <w:rPr>
+          <w:sz w:val="23"/>
+          <w:szCs w:val="24"/>
+        </w:rPr>
+        <w:t>LocalSystem</w:t>
+      </w:r>
+      <w:proofErr w:type="spellEnd"/>
+      <w:r>
+        <w:rPr>
+          <w:sz w:val="23"/>
+          <w:szCs w:val="24"/>
+        </w:rPr>
+        <w:t xml:space="preserve"> Windows service.</w:t>
       </w:r>
     </w:p>
     <w:p>
@@ -5135,7 +5265,79 @@
           <w:sz w:val="18"/>
           <w:szCs w:val="24"/>
         </w:rPr>
-        <w:t>CHROME_HISTORY user=&lt;WindowsUser&gt; profile=&lt;ChromeProfile&gt; visit_id=&lt;ID&gt; time=&lt;LOCAL_TIME&gt; url=&lt;URL&gt; title=&lt;TITLE&gt;</w:t>
+        <w:t>CHROME_HISTORY user=&lt;</w:t>
+      </w:r>
+      <w:proofErr w:type="spellStart"/>
+      <w:r>
+        <w:rPr>
+          <w:rFonts w:ascii="Consolas" w:hAnsi="Consolas"/>
+          <w:sz w:val="18"/>
+          <w:szCs w:val="24"/>
+        </w:rPr>
+        <w:t>WindowsUser</w:t>
+      </w:r>
+      <w:proofErr w:type="spellEnd"/>
+      <w:r>
+        <w:rPr>
+          <w:rFonts w:ascii="Consolas" w:hAnsi="Consolas"/>
+          <w:sz w:val="18"/>
+          <w:szCs w:val="24"/>
+        </w:rPr>
+        <w:t>&gt; profile=&lt;</w:t>
+      </w:r>
+      <w:proofErr w:type="spellStart"/>
+      <w:r>
+        <w:rPr>
+          <w:rFonts w:ascii="Consolas" w:hAnsi="Consolas"/>
+          <w:sz w:val="18"/>
+          <w:szCs w:val="24"/>
+        </w:rPr>
+        <w:t>ChromeProfile</w:t>
+      </w:r>
+      <w:proofErr w:type="spellEnd"/>
+      <w:r>
+        <w:rPr>
+          <w:rFonts w:ascii="Consolas" w:hAnsi="Consolas"/>
+          <w:sz w:val="18"/>
+          <w:szCs w:val="24"/>
+        </w:rPr>
+        <w:t xml:space="preserve">&gt; </w:t>
+      </w:r>
+      <w:proofErr w:type="spellStart"/>
+      <w:r>
+        <w:rPr>
+          <w:rFonts w:ascii="Consolas" w:hAnsi="Consolas"/>
+          <w:sz w:val="18"/>
+          <w:szCs w:val="24"/>
+        </w:rPr>
+        <w:t>visit_id</w:t>
+      </w:r>
+      <w:proofErr w:type="spellEnd"/>
+      <w:r>
+        <w:rPr>
+          <w:rFonts w:ascii="Consolas" w:hAnsi="Consolas"/>
+          <w:sz w:val="18"/>
+          <w:szCs w:val="24"/>
+        </w:rPr>
+        <w:t xml:space="preserve">=&lt;ID&gt; time=&lt;LOCAL_TIME&gt; </w:t>
+      </w:r>
+      <w:proofErr w:type="spellStart"/>
+      <w:r>
+        <w:rPr>
+          <w:rFonts w:ascii="Consolas" w:hAnsi="Consolas"/>
+          <w:sz w:val="18"/>
+          <w:szCs w:val="24"/>
+        </w:rPr>
+        <w:t>url</w:t>
+      </w:r>
+      <w:proofErr w:type="spellEnd"/>
+      <w:r>
+        <w:rPr>
+          <w:rFonts w:ascii="Consolas" w:hAnsi="Consolas"/>
+          <w:sz w:val="18"/>
+          <w:szCs w:val="24"/>
+        </w:rPr>
+        <w:t>=&lt;URL&gt; title=&lt;TITLE&gt;</w:t>
       </w:r>
     </w:p>
     <w:p>
@@ -5214,8 +5416,28 @@
           <w:sz w:val="18"/>
           <w:szCs w:val="24"/>
         </w:rPr>
-        <w:t>Get-Service "Chrome Upload Detector" | Select Name,Status,StartType</w:t>
-      </w:r>
+        <w:t xml:space="preserve">Get-Service "Chrome Upload Detector" | Select </w:t>
+      </w:r>
+      <w:proofErr w:type="spellStart"/>
+      <w:proofErr w:type="gramStart"/>
+      <w:r>
+        <w:rPr>
+          <w:rFonts w:ascii="Consolas" w:hAnsi="Consolas"/>
+          <w:sz w:val="18"/>
+          <w:szCs w:val="24"/>
+        </w:rPr>
+        <w:t>Name,Status</w:t>
+      </w:r>
+      <w:proofErr w:type="gramEnd"/>
+      <w:r>
+        <w:rPr>
+          <w:rFonts w:ascii="Consolas" w:hAnsi="Consolas"/>
+          <w:sz w:val="18"/>
+          <w:szCs w:val="24"/>
+        </w:rPr>
+        <w:t>,StartType</w:t>
+      </w:r>
+      <w:proofErr w:type="spellEnd"/>
     </w:p>
     <w:p>
       <w:pPr>
@@ -5233,8 +5455,56 @@
           <w:sz w:val="18"/>
           <w:szCs w:val="24"/>
         </w:rPr>
-        <w:t>Get-ScheduledTask -TaskName "Chrome History Monitor" | Select TaskName,State</w:t>
-      </w:r>
+        <w:t>Get-</w:t>
+      </w:r>
+      <w:proofErr w:type="spellStart"/>
+      <w:r>
+        <w:rPr>
+          <w:rFonts w:ascii="Consolas" w:hAnsi="Consolas"/>
+          <w:sz w:val="18"/>
+          <w:szCs w:val="24"/>
+        </w:rPr>
+        <w:t>ScheduledTask</w:t>
+      </w:r>
+      <w:proofErr w:type="spellEnd"/>
+      <w:r>
+        <w:rPr>
+          <w:rFonts w:ascii="Consolas" w:hAnsi="Consolas"/>
+          <w:sz w:val="18"/>
+          <w:szCs w:val="24"/>
+        </w:rPr>
+        <w:t xml:space="preserve"> -</w:t>
+      </w:r>
+      <w:proofErr w:type="spellStart"/>
+      <w:r>
+        <w:rPr>
+          <w:rFonts w:ascii="Consolas" w:hAnsi="Consolas"/>
+          <w:sz w:val="18"/>
+          <w:szCs w:val="24"/>
+        </w:rPr>
+        <w:t>TaskName</w:t>
+      </w:r>
+      <w:proofErr w:type="spellEnd"/>
+      <w:r>
+        <w:rPr>
+          <w:rFonts w:ascii="Consolas" w:hAnsi="Consolas"/>
+          <w:sz w:val="18"/>
+          <w:szCs w:val="24"/>
+        </w:rPr>
+        <w:t xml:space="preserve"> "Chrome History Monitor" | Select </w:t>
+      </w:r>
+      <w:proofErr w:type="spellStart"/>
+      <w:proofErr w:type="gramStart"/>
+      <w:r>
+        <w:rPr>
+          <w:rFonts w:ascii="Consolas" w:hAnsi="Consolas"/>
+          <w:sz w:val="18"/>
+          <w:szCs w:val="24"/>
+        </w:rPr>
+        <w:t>TaskName,State</w:t>
+      </w:r>
+      <w:proofErr w:type="spellEnd"/>
+      <w:proofErr w:type="gramEnd"/>
     </w:p>
     <w:p>
       <w:pPr>
@@ -5329,8 +5599,72 @@
           <w:sz w:val="18"/>
           <w:szCs w:val="24"/>
         </w:rPr>
-        <w:t>Get-NetTCPConnection -LocalPort 8765 -ErrorAction SilentlyContinue</w:t>
-      </w:r>
+        <w:t>Get-</w:t>
+      </w:r>
+      <w:proofErr w:type="spellStart"/>
+      <w:r>
+        <w:rPr>
+          <w:rFonts w:ascii="Consolas" w:hAnsi="Consolas"/>
+          <w:sz w:val="18"/>
+          <w:szCs w:val="24"/>
+        </w:rPr>
+        <w:t>NetTCPConnection</w:t>
+      </w:r>
+      <w:proofErr w:type="spellEnd"/>
+      <w:r>
+        <w:rPr>
+          <w:rFonts w:ascii="Consolas" w:hAnsi="Consolas"/>
+          <w:sz w:val="18"/>
+          <w:szCs w:val="24"/>
+        </w:rPr>
+        <w:t xml:space="preserve"> -</w:t>
+      </w:r>
+      <w:proofErr w:type="spellStart"/>
+      <w:r>
+        <w:rPr>
+          <w:rFonts w:ascii="Consolas" w:hAnsi="Consolas"/>
+          <w:sz w:val="18"/>
+          <w:szCs w:val="24"/>
+        </w:rPr>
+        <w:t>LocalPort</w:t>
+      </w:r>
+      <w:proofErr w:type="spellEnd"/>
+      <w:r>
+        <w:rPr>
+          <w:rFonts w:ascii="Consolas" w:hAnsi="Consolas"/>
+          <w:sz w:val="18"/>
+          <w:szCs w:val="24"/>
+        </w:rPr>
+        <w:t xml:space="preserve"> 8765 -</w:t>
+      </w:r>
+      <w:proofErr w:type="spellStart"/>
+      <w:r>
+        <w:rPr>
+          <w:rFonts w:ascii="Consolas" w:hAnsi="Consolas"/>
+          <w:sz w:val="18"/>
+          <w:szCs w:val="24"/>
+        </w:rPr>
+        <w:t>ErrorAction</w:t>
+      </w:r>
+      <w:proofErr w:type="spellEnd"/>
+      <w:r>
+        <w:rPr>
+          <w:rFonts w:ascii="Consolas" w:hAnsi="Consolas"/>
+          <w:sz w:val="18"/>
+          <w:szCs w:val="24"/>
+        </w:rPr>
+        <w:t xml:space="preserve"> </w:t>
+      </w:r>
+      <w:proofErr w:type="spellStart"/>
+      <w:r>
+        <w:rPr>
+          <w:rFonts w:ascii="Consolas" w:hAnsi="Consolas"/>
+          <w:sz w:val="18"/>
+          <w:szCs w:val="24"/>
+        </w:rPr>
+        <w:t>SilentlyContinue</w:t>
+      </w:r>
+      <w:proofErr w:type="spellEnd"/>
     </w:p>
     <w:p>
       <w:pPr>
@@ -5348,8 +5682,64 @@
           <w:sz w:val="18"/>
           <w:szCs w:val="24"/>
         </w:rPr>
-        <w:t>Get-ScheduledTaskInfo -TaskName "Chrome History Monitor" | Select LastRunTime,NextRunTime,LastTaskResult</w:t>
-      </w:r>
+        <w:t>Get-</w:t>
+      </w:r>
+      <w:proofErr w:type="spellStart"/>
+      <w:r>
+        <w:rPr>
+          <w:rFonts w:ascii="Consolas" w:hAnsi="Consolas"/>
+          <w:sz w:val="18"/>
+          <w:szCs w:val="24"/>
+        </w:rPr>
+        <w:t>ScheduledTaskInfo</w:t>
+      </w:r>
+      <w:proofErr w:type="spellEnd"/>
+      <w:r>
+        <w:rPr>
+          <w:rFonts w:ascii="Consolas" w:hAnsi="Consolas"/>
+          <w:sz w:val="18"/>
+          <w:szCs w:val="24"/>
+        </w:rPr>
+        <w:t xml:space="preserve"> -</w:t>
+      </w:r>
+      <w:proofErr w:type="spellStart"/>
+      <w:r>
+        <w:rPr>
+          <w:rFonts w:ascii="Consolas" w:hAnsi="Consolas"/>
+          <w:sz w:val="18"/>
+          <w:szCs w:val="24"/>
+        </w:rPr>
+        <w:t>TaskName</w:t>
+      </w:r>
+      <w:proofErr w:type="spellEnd"/>
+      <w:r>
+        <w:rPr>
+          <w:rFonts w:ascii="Consolas" w:hAnsi="Consolas"/>
+          <w:sz w:val="18"/>
+          <w:szCs w:val="24"/>
+        </w:rPr>
+        <w:t xml:space="preserve"> "Chrome History Monitor" | Select </w:t>
+      </w:r>
+      <w:proofErr w:type="spellStart"/>
+      <w:proofErr w:type="gramStart"/>
+      <w:r>
+        <w:rPr>
+          <w:rFonts w:ascii="Consolas" w:hAnsi="Consolas"/>
+          <w:sz w:val="18"/>
+          <w:szCs w:val="24"/>
+        </w:rPr>
+        <w:t>LastRunTime,NextRunTime</w:t>
+      </w:r>
+      <w:proofErr w:type="gramEnd"/>
+      <w:r>
+        <w:rPr>
+          <w:rFonts w:ascii="Consolas" w:hAnsi="Consolas"/>
+          <w:sz w:val="18"/>
+          <w:szCs w:val="24"/>
+        </w:rPr>
+        <w:t>,LastTaskResult</w:t>
+      </w:r>
+      <w:proofErr w:type="spellEnd"/>
     </w:p>
     <w:p>
       <w:pPr>
@@ -5723,7 +6113,32 @@
                 <w:sz w:val="20"/>
                 <w:szCs w:val="24"/>
               </w:rPr>
-              <w:t>Here-string closing markers must begin at column zero. Validate with Parser::ParseFile before installing.</w:t>
+              <w:t xml:space="preserve">Here-string closing markers must begin at column zero. Validate with </w:t>
+            </w:r>
+            <w:proofErr w:type="gramStart"/>
+            <w:r>
+              <w:rPr>
+                <w:sz w:val="20"/>
+                <w:szCs w:val="24"/>
+              </w:rPr>
+              <w:t>Parser::</w:t>
+            </w:r>
+            <w:proofErr w:type="spellStart"/>
+            <w:proofErr w:type="gramEnd"/>
+            <w:r>
+              <w:rPr>
+                <w:sz w:val="20"/>
+                <w:szCs w:val="24"/>
+              </w:rPr>
+              <w:t>ParseFile</w:t>
+            </w:r>
+            <w:proofErr w:type="spellEnd"/>
+            <w:r>
+              <w:rPr>
+                <w:sz w:val="20"/>
+                <w:szCs w:val="24"/>
+              </w:rPr>
+              <w:t xml:space="preserve"> before installing.</w:t>
             </w:r>
           </w:p>
         </w:tc>
@@ -5859,7 +6274,23 @@
                 <w:sz w:val="20"/>
                 <w:szCs w:val="24"/>
               </w:rPr>
-              <w:t>Use the explicit installed sqlite3.exe path under ProgramData.</w:t>
+              <w:t xml:space="preserve">Use the explicit installed sqlite3.exe path under </w:t>
+            </w:r>
+            <w:proofErr w:type="spellStart"/>
+            <w:r>
+              <w:rPr>
+                <w:sz w:val="20"/>
+                <w:szCs w:val="24"/>
+              </w:rPr>
+              <w:t>ProgramData</w:t>
+            </w:r>
+            <w:proofErr w:type="spellEnd"/>
+            <w:r>
+              <w:rPr>
+                <w:sz w:val="20"/>
+                <w:szCs w:val="24"/>
+              </w:rPr>
+              <w:t>.</w:t>
             </w:r>
           </w:p>
         </w:tc>
@@ -5927,7 +6358,23 @@
                 <w:sz w:val="20"/>
                 <w:szCs w:val="24"/>
               </w:rPr>
-              <w:t>Use WAL, busy_timeout, one transaction per collection cycle and an overlap guard.</w:t>
+              <w:t xml:space="preserve">Use WAL, </w:t>
+            </w:r>
+            <w:proofErr w:type="spellStart"/>
+            <w:r>
+              <w:rPr>
+                <w:sz w:val="20"/>
+                <w:szCs w:val="24"/>
+              </w:rPr>
+              <w:t>busy_timeout</w:t>
+            </w:r>
+            <w:proofErr w:type="spellEnd"/>
+            <w:r>
+              <w:rPr>
+                <w:sz w:val="20"/>
+                <w:szCs w:val="24"/>
+              </w:rPr>
+              <w:t>, one transaction per collection cycle and an overlap guard.</w:t>
             </w:r>
           </w:p>
         </w:tc>
@@ -5995,7 +6442,23 @@
                 <w:sz w:val="20"/>
                 <w:szCs w:val="24"/>
               </w:rPr>
-              <w:t>Check service/collector logs, then the Wazuh Agent localfile configuration and Manager rules.</w:t>
+              <w:t xml:space="preserve">Check service/collector logs, then the Wazuh Agent </w:t>
+            </w:r>
+            <w:proofErr w:type="spellStart"/>
+            <w:r>
+              <w:rPr>
+                <w:sz w:val="20"/>
+                <w:szCs w:val="24"/>
+              </w:rPr>
+              <w:t>localfile</w:t>
+            </w:r>
+            <w:proofErr w:type="spellEnd"/>
+            <w:r>
+              <w:rPr>
+                <w:sz w:val="20"/>
+                <w:szCs w:val="24"/>
+              </w:rPr>
+              <w:t xml:space="preserve"> configuration and Manager rules.</w:t>
             </w:r>
           </w:p>
         </w:tc>
@@ -6164,7 +6627,39 @@
           <w:sz w:val="23"/>
           <w:szCs w:val="24"/>
         </w:rPr>
-        <w:t>A fresh endpoint deployment should result in one common ProgramData directory containing the collector, receiver, service binary, SQLite executable, logs, archive and ChromeUploadDetector-MVP extension directory. The Wazuh Agent identifies the endpoint; the history collector supplies browser/user context; the upload service supplies upload activity; the Wazuh Manager applies rules; and the Dashboard provides the operational view.</w:t>
+        <w:t xml:space="preserve">A fresh endpoint deployment should result in one common </w:t>
+      </w:r>
+      <w:proofErr w:type="spellStart"/>
+      <w:r>
+        <w:rPr>
+          <w:sz w:val="23"/>
+          <w:szCs w:val="24"/>
+        </w:rPr>
+        <w:t>ProgramData</w:t>
+      </w:r>
+      <w:proofErr w:type="spellEnd"/>
+      <w:r>
+        <w:rPr>
+          <w:sz w:val="23"/>
+          <w:szCs w:val="24"/>
+        </w:rPr>
+        <w:t xml:space="preserve"> directory containing the collector, receiver, service binary, SQLite executable, logs, archive and </w:t>
+      </w:r>
+      <w:proofErr w:type="spellStart"/>
+      <w:r>
+        <w:rPr>
+          <w:sz w:val="23"/>
+          <w:szCs w:val="24"/>
+        </w:rPr>
+        <w:t>ChromeUploadDetector</w:t>
+      </w:r>
+      <w:proofErr w:type="spellEnd"/>
+      <w:r>
+        <w:rPr>
+          <w:sz w:val="23"/>
+          <w:szCs w:val="24"/>
+        </w:rPr>
+        <w:t>-MVP extension directory. The Wazuh Agent identifies the endpoint; the history collector supplies browser/user context; the upload service supplies upload activity; the Wazuh Manager applies rules; and the Dashboard provides the operational view.</w:t>
       </w:r>
     </w:p>
     <w:p>
@@ -6248,23 +6743,59 @@
           <w:szCs w:val="24"/>
         </w:rPr>
         <w:br/>
-        <w:t>├── ChromeUploadDetector-MVP\</w:t>
-      </w:r>
+        <w:t xml:space="preserve">├── </w:t>
+      </w:r>
+      <w:proofErr w:type="spellStart"/>
       <w:r>
         <w:rPr>
           <w:rFonts w:ascii="Consolas" w:hAnsi="Consolas"/>
           <w:sz w:val="18"/>
           <w:szCs w:val="24"/>
         </w:rPr>
-        <w:br/>
-        <w:t>│   └── ChromeUploadDetector-MVP\</w:t>
-      </w:r>
+        <w:t>ChromeUploadDetector</w:t>
+      </w:r>
+      <w:proofErr w:type="spellEnd"/>
       <w:r>
         <w:rPr>
           <w:rFonts w:ascii="Consolas" w:hAnsi="Consolas"/>
           <w:sz w:val="18"/>
           <w:szCs w:val="24"/>
         </w:rPr>
+        <w:t>-MVP\</w:t>
+      </w:r>
+      <w:r>
+        <w:rPr>
+          <w:rFonts w:ascii="Consolas" w:hAnsi="Consolas"/>
+          <w:sz w:val="18"/>
+          <w:szCs w:val="24"/>
+        </w:rPr>
+        <w:br/>
+        <w:t xml:space="preserve">│   └── </w:t>
+      </w:r>
+      <w:proofErr w:type="spellStart"/>
+      <w:r>
+        <w:rPr>
+          <w:rFonts w:ascii="Consolas" w:hAnsi="Consolas"/>
+          <w:sz w:val="18"/>
+          <w:szCs w:val="24"/>
+        </w:rPr>
+        <w:t>ChromeUploadDetector</w:t>
+      </w:r>
+      <w:proofErr w:type="spellEnd"/>
+      <w:r>
+        <w:rPr>
+          <w:rFonts w:ascii="Consolas" w:hAnsi="Consolas"/>
+          <w:sz w:val="18"/>
+          <w:szCs w:val="24"/>
+        </w:rPr>
+        <w:t>-MVP\</w:t>
+      </w:r>
+      <w:r>
+        <w:rPr>
+          <w:rFonts w:ascii="Consolas" w:hAnsi="Consolas"/>
+          <w:sz w:val="18"/>
+          <w:szCs w:val="24"/>
+        </w:rPr>
         <w:br/>
         <w:t>│       └── &lt;Chrome extension files&gt;</w:t>
       </w:r>
@@ -6284,8 +6815,18 @@
           <w:szCs w:val="24"/>
         </w:rPr>
         <w:br/>
-        <w:t>├── chrome_history_archive.db</w:t>
-      </w:r>
+        <w:t xml:space="preserve">├── </w:t>
+      </w:r>
+      <w:proofErr w:type="spellStart"/>
+      <w:r>
+        <w:rPr>
+          <w:rFonts w:ascii="Consolas" w:hAnsi="Consolas"/>
+          <w:sz w:val="18"/>
+          <w:szCs w:val="24"/>
+        </w:rPr>
+        <w:t>chrome_history_archive.db</w:t>
+      </w:r>
+      <w:proofErr w:type="spellEnd"/>
       <w:r>
         <w:rPr>
           <w:rFonts w:ascii="Consolas" w:hAnsi="Consolas"/>

</xml_diff>